<commit_message>
feat(hero): NovaMóvil hero scoped under .hero-novamovil
- hero.js adds .hero-novamovil and builds the text column (eyebrow,
  title with gradient <em>, description, button row, stats list) and
  the media column (eager, high-priority image); cells are detected by
  content, and missing parts are tolerated
- hero.css: native nesting inside .hero-novamovil, each part with its
  media query below; navy diagonal gradient with decorative circles,
  one column without image below 900px, text + image card from 900px.
  Only exception: the hero section wrapper spans the full width
- Colours from styles/colors.css: new --hero-* tokens plus
  --color-navy-700 and --color-slate-300 measured from the design
- content-drive/index.docx: Hero table (text + image) as the first
  section, before Categorías

Co-Authored-By: Claude Opus 5.5 (1M context) <noreply@anthropic.com>
</commit_message>
<xml_diff>
--- a/content-drive/index.docx
+++ b/content-drive/index.docx
@@ -1,7 +1,185 @@
 
 <file path=word/document.xml><?xml version="1.0" encoding="utf-8"?>
-<w:document xmlns:w="http://schemas.openxmlformats.org/wordprocessingml/2006/main" xmlns:r="http://schemas.openxmlformats.org/officeDocument/2006/relationships">
+<w:document xmlns:w="http://schemas.openxmlformats.org/wordprocessingml/2006/main" xmlns:r="http://schemas.openxmlformats.org/officeDocument/2006/relationships" xmlns:wp="http://schemas.openxmlformats.org/drawingml/2006/wordprocessingDrawing" xmlns:a="http://schemas.openxmlformats.org/drawingml/2006/main" xmlns:pic="http://schemas.openxmlformats.org/drawingml/2006/picture">
   <w:body>
+    <w:tbl>
+      <w:tblPr>
+        <w:tblW w:w="0" w:type="auto"/>
+        <w:tblBorders>
+          <w:top w:val="single" w:sz="4" w:color="999999"/>
+          <w:left w:val="single" w:sz="4" w:color="999999"/>
+          <w:bottom w:val="single" w:sz="4" w:color="999999"/>
+          <w:right w:val="single" w:sz="4" w:color="999999"/>
+          <w:insideH w:val="single" w:sz="4" w:color="999999"/>
+          <w:insideV w:val="single" w:sz="4" w:color="999999"/>
+        </w:tblBorders>
+      </w:tblPr>
+      <w:tblGrid>
+        <w:gridCol w:w="4500"/>
+        <w:gridCol w:w="4500"/>
+      </w:tblGrid>
+      <w:tr>
+        <w:tc>
+          <w:tcPr>
+            <w:gridSpan w:val="2"/>
+          </w:tcPr>
+          <w:p>
+            <w:r>
+              <w:t xml:space="preserve">Hero</w:t>
+            </w:r>
+          </w:p>
+        </w:tc>
+      </w:tr>
+      <w:tr>
+        <w:tc>
+          <w:p>
+            <w:r>
+              <w:t xml:space="preserve">Lanzamiento exclusivo 2026</w:t>
+            </w:r>
+          </w:p>
+          <w:p>
+            <w:pPr>
+              <w:pStyle w:val="Heading1"/>
+            </w:pPr>
+            <w:r>
+              <w:t xml:space="preserve">El futuro de la </w:t>
+            </w:r>
+            <w:r>
+              <w:rPr>
+                <w:i/>
+              </w:rPr>
+              <w:t xml:space="preserve">conectividad</w:t>
+            </w:r>
+            <w:r>
+              <w:t xml:space="preserve"> está aquí</w:t>
+            </w:r>
+          </w:p>
+          <w:p>
+            <w:r>
+              <w:t xml:space="preserve">Los mejores smartphones del mercado con planes ilimitados diseñados para México. Conéctate sin límites.</w:t>
+            </w:r>
+          </w:p>
+          <w:p>
+            <w:hyperlink r:id="rIdL1">
+              <w:r>
+                <w:rPr>
+                  <w:b/>
+                  <w:color w:val="1155CC"/>
+                  <w:u w:val="single"/>
+                </w:rPr>
+                <w:t xml:space="preserve">Ver celulares</w:t>
+              </w:r>
+            </w:hyperlink>
+          </w:p>
+          <w:p>
+            <w:hyperlink r:id="rIdL2">
+              <w:r>
+                <w:rPr>
+                  <w:i/>
+                  <w:color w:val="1155CC"/>
+                  <w:u w:val="single"/>
+                </w:rPr>
+                <w:t xml:space="preserve">Ver planes</w:t>
+              </w:r>
+            </w:hyperlink>
+          </w:p>
+          <w:p>
+            <w:pPr>
+              <w:numPr>
+                <w:ilvl w:val="0"/>
+                <w:numId w:val="1"/>
+              </w:numPr>
+            </w:pPr>
+            <w:r>
+              <w:rPr>
+                <w:b/>
+              </w:rPr>
+              <w:t xml:space="preserve">4.9M+</w:t>
+            </w:r>
+            <w:r>
+              <w:t xml:space="preserve"> Usuarios activos</w:t>
+            </w:r>
+          </w:p>
+          <w:p>
+            <w:pPr>
+              <w:numPr>
+                <w:ilvl w:val="0"/>
+                <w:numId w:val="1"/>
+              </w:numPr>
+            </w:pPr>
+            <w:r>
+              <w:rPr>
+                <w:b/>
+              </w:rPr>
+              <w:t xml:space="preserve">99.8%</w:t>
+            </w:r>
+            <w:r>
+              <w:t xml:space="preserve"> Cobertura 5G</w:t>
+            </w:r>
+          </w:p>
+          <w:p>
+            <w:pPr>
+              <w:numPr>
+                <w:ilvl w:val="0"/>
+                <w:numId w:val="1"/>
+              </w:numPr>
+            </w:pPr>
+            <w:r>
+              <w:rPr>
+                <w:b/>
+              </w:rPr>
+              <w:t xml:space="preserve">24/7</w:t>
+            </w:r>
+            <w:r>
+              <w:t xml:space="preserve"> Soporte</w:t>
+            </w:r>
+          </w:p>
+        </w:tc>
+        <w:tc>
+          <w:p>
+            <w:r>
+              <w:drawing>
+                <wp:inline distT="0" distB="0" distL="0" distR="0">
+                  <wp:extent cx="3333750" cy="3333750"/>
+                  <wp:docPr id="1" name="Picture 1" descr="Smartphone NovaMóvil sobre fondo oscuro"/>
+                  <a:graphic>
+                    <a:graphicData uri="http://schemas.openxmlformats.org/drawingml/2006/picture">
+                      <pic:pic>
+                        <pic:nvPicPr>
+                          <pic:cNvPr id="1" name="image1.jpeg" descr="Smartphone NovaMóvil sobre fondo oscuro"/>
+                          <pic:cNvPicPr/>
+                        </pic:nvPicPr>
+                        <pic:blipFill>
+                          <a:blip r:embed="rIdImg1"/>
+                          <a:stretch>
+                            <a:fillRect/>
+                          </a:stretch>
+                        </pic:blipFill>
+                        <pic:spPr>
+                          <a:xfrm>
+                            <a:off x="0" y="0"/>
+                            <a:ext cx="3333750" cy="3333750"/>
+                          </a:xfrm>
+                          <a:prstGeom prst="rect">
+                            <a:avLst/>
+                          </a:prstGeom>
+                        </pic:spPr>
+                      </pic:pic>
+                    </a:graphicData>
+                  </a:graphic>
+                </wp:inline>
+              </w:drawing>
+            </w:r>
+          </w:p>
+        </w:tc>
+      </w:tr>
+    </w:tbl>
+    <w:p/>
+    <w:p>
+      <w:r>
+        <w:t xml:space="preserve">---</w:t>
+      </w:r>
+    </w:p>
     <w:p>
       <w:pPr>
         <w:pStyle w:val="Heading2"/>
@@ -42,7 +220,7 @@
             </w:r>
           </w:p>
           <w:p>
-            <w:hyperlink r:id="rIdL1">
+            <w:hyperlink r:id="rIdL3">
               <w:r>
                 <w:rPr>
                   <w:color w:val="1155CC"/>
@@ -62,7 +240,7 @@
             </w:r>
           </w:p>
           <w:p>
-            <w:hyperlink r:id="rIdL2">
+            <w:hyperlink r:id="rIdL4">
               <w:r>
                 <w:rPr>
                   <w:color w:val="1155CC"/>
@@ -82,7 +260,7 @@
             </w:r>
           </w:p>
           <w:p>
-            <w:hyperlink r:id="rIdL3">
+            <w:hyperlink r:id="rIdL5">
               <w:r>
                 <w:rPr>
                   <w:color w:val="1155CC"/>
@@ -102,7 +280,7 @@
             </w:r>
           </w:p>
           <w:p>
-            <w:hyperlink r:id="rIdL4">
+            <w:hyperlink r:id="rIdL6">
               <w:r>
                 <w:rPr>
                   <w:color w:val="1155CC"/>
@@ -122,7 +300,7 @@
             </w:r>
           </w:p>
           <w:p>
-            <w:hyperlink r:id="rIdL5">
+            <w:hyperlink r:id="rIdL7">
               <w:r>
                 <w:rPr>
                   <w:color w:val="1155CC"/>
@@ -142,7 +320,7 @@
             </w:r>
           </w:p>
           <w:p>
-            <w:hyperlink r:id="rIdL6">
+            <w:hyperlink r:id="rIdL8">
               <w:r>
                 <w:rPr>
                   <w:color w:val="1155CC"/>
@@ -170,7 +348,7 @@
       </w:r>
     </w:p>
     <w:p>
-      <w:hyperlink r:id="rIdL7">
+      <w:hyperlink r:id="rIdL9">
         <w:r>
           <w:rPr>
             <w:color w:val="1155CC"/>
@@ -269,7 +447,7 @@
             </w:r>
           </w:p>
           <w:p>
-            <w:hyperlink r:id="rIdL8">
+            <w:hyperlink r:id="rIdL10">
               <w:r>
                 <w:rPr>
                   <w:color w:val="1155CC"/>
@@ -342,7 +520,7 @@
             </w:r>
           </w:p>
           <w:p>
-            <w:hyperlink r:id="rIdL9">
+            <w:hyperlink r:id="rIdL11">
               <w:r>
                 <w:rPr>
                   <w:color w:val="1155CC"/>
@@ -407,7 +585,7 @@
             </w:r>
           </w:p>
           <w:p>
-            <w:hyperlink r:id="rIdL10">
+            <w:hyperlink r:id="rIdL12">
               <w:r>
                 <w:rPr>
                   <w:color w:val="1155CC"/>
@@ -480,7 +658,7 @@
             </w:r>
           </w:p>
           <w:p>
-            <w:hyperlink r:id="rIdL11">
+            <w:hyperlink r:id="rIdL13">
               <w:r>
                 <w:rPr>
                   <w:color w:val="1155CC"/>
@@ -562,7 +740,7 @@
 </file>
 
 <file path=word/numbering.xml><?xml version="1.0" encoding="utf-8"?>
-<w:numbering xmlns:w="http://schemas.openxmlformats.org/wordprocessingml/2006/main" xmlns:r="http://schemas.openxmlformats.org/officeDocument/2006/relationships">
+<w:numbering xmlns:w="http://schemas.openxmlformats.org/wordprocessingml/2006/main" xmlns:r="http://schemas.openxmlformats.org/officeDocument/2006/relationships" xmlns:wp="http://schemas.openxmlformats.org/drawingml/2006/wordprocessingDrawing" xmlns:a="http://schemas.openxmlformats.org/drawingml/2006/main" xmlns:pic="http://schemas.openxmlformats.org/drawingml/2006/picture">
   <w:abstractNum w:abstractNumId="0">
     <w:lvl w:ilvl="0">
       <w:start w:val="1"/>
@@ -605,7 +783,7 @@
 </file>
 
 <file path=word/styles.xml><?xml version="1.0" encoding="utf-8"?>
-<w:styles xmlns:w="http://schemas.openxmlformats.org/wordprocessingml/2006/main" xmlns:r="http://schemas.openxmlformats.org/officeDocument/2006/relationships">
+<w:styles xmlns:w="http://schemas.openxmlformats.org/wordprocessingml/2006/main" xmlns:r="http://schemas.openxmlformats.org/officeDocument/2006/relationships" xmlns:wp="http://schemas.openxmlformats.org/drawingml/2006/wordprocessingDrawing" xmlns:a="http://schemas.openxmlformats.org/drawingml/2006/main" xmlns:pic="http://schemas.openxmlformats.org/drawingml/2006/picture">
   <w:style w:type="paragraph" w:default="1" w:styleId="Normal">
     <w:name w:val="Normal"/>
     <w:qFormat/>

</xml_diff>

<commit_message>
feat(card-promotions): service-fed promotion cards with colour gradient
- blocks/card-promotions: rows Title, Endpoint, Promo Link
  (/promociones/{id}), Alert Duration, Alert Color. Loads
  data.promotions through the HTTP client (internal JSON without an
  endpoint); on error logs it, shows the floating alert and the empty
  message. Active promotions by order, text-only rendering, validated
  URLs and hex colours
- Styles nested in .card-promotions: photo cards with a gradient in each
  promotion's colour from the bottom up, white title and text; one card
  per row on mobile, three per row from 768px (balanced rows when there
  are more); hover only lifts the card 4px
- colors.css: --card-promotions-* tokens reusing existing ones
- content-drive/index.docx: new Card Promotions section after the
  featured products

Co-Authored-By: Claude Opus 5.5 (1M context) <noreply@anthropic.com>
</commit_message>
<xml_diff>
--- a/content-drive/index.docx
+++ b/content-drive/index.docx
@@ -377,6 +377,127 @@
           <w:p>
             <w:r>
               <w:t xml:space="preserve">/productos/{sku}</w:t>
+            </w:r>
+          </w:p>
+        </w:tc>
+      </w:tr>
+      <w:tr>
+        <w:tc>
+          <w:p>
+            <w:r>
+              <w:t xml:space="preserve">Alert Duration</w:t>
+            </w:r>
+          </w:p>
+        </w:tc>
+        <w:tc>
+          <w:p>
+            <w:r>
+              <w:t xml:space="preserve">5</w:t>
+            </w:r>
+          </w:p>
+        </w:tc>
+      </w:tr>
+      <w:tr>
+        <w:tc>
+          <w:p>
+            <w:r>
+              <w:t xml:space="preserve">Alert Color</w:t>
+            </w:r>
+          </w:p>
+        </w:tc>
+        <w:tc>
+          <w:p>
+            <w:r>
+              <w:t xml:space="preserve">error</w:t>
+            </w:r>
+          </w:p>
+        </w:tc>
+      </w:tr>
+    </w:tbl>
+    <w:p/>
+    <w:p>
+      <w:r>
+        <w:t xml:space="preserve">---</w:t>
+      </w:r>
+    </w:p>
+    <w:tbl>
+      <w:tblPr>
+        <w:tblW w:w="0" w:type="auto"/>
+        <w:tblBorders>
+          <w:top w:val="single" w:sz="4" w:color="999999"/>
+          <w:left w:val="single" w:sz="4" w:color="999999"/>
+          <w:bottom w:val="single" w:sz="4" w:color="999999"/>
+          <w:right w:val="single" w:sz="4" w:color="999999"/>
+          <w:insideH w:val="single" w:sz="4" w:color="999999"/>
+          <w:insideV w:val="single" w:sz="4" w:color="999999"/>
+        </w:tblBorders>
+      </w:tblPr>
+      <w:tblGrid>
+        <w:gridCol w:w="4500"/>
+        <w:gridCol w:w="4500"/>
+      </w:tblGrid>
+      <w:tr>
+        <w:tc>
+          <w:tcPr>
+            <w:gridSpan w:val="2"/>
+          </w:tcPr>
+          <w:p>
+            <w:r>
+              <w:t xml:space="preserve">Card Promotions</w:t>
+            </w:r>
+          </w:p>
+        </w:tc>
+      </w:tr>
+      <w:tr>
+        <w:tc>
+          <w:p>
+            <w:r>
+              <w:t xml:space="preserve">Title</w:t>
+            </w:r>
+          </w:p>
+        </w:tc>
+        <w:tc>
+          <w:p>
+            <w:r>
+              <w:t xml:space="preserve">Promociones</w:t>
+            </w:r>
+          </w:p>
+        </w:tc>
+      </w:tr>
+      <w:tr>
+        <w:tc>
+          <w:p>
+            <w:r>
+              <w:t xml:space="preserve">Endpoint</w:t>
+            </w:r>
+          </w:p>
+        </w:tc>
+        <w:tc>
+          <w:p>
+            <w:hyperlink r:id="rIdL6">
+              <w:r>
+                <w:rPr>
+                  <w:color w:val="1155CC"/>
+                  <w:u w:val="single"/>
+                </w:rPr>
+                <w:t xml:space="preserve">https://cca7ebd1-f76f-47d0-a949-b4b8618f05e5.mock.pstmn.io/api/v1/home/promotions</w:t>
+              </w:r>
+            </w:hyperlink>
+          </w:p>
+        </w:tc>
+      </w:tr>
+      <w:tr>
+        <w:tc>
+          <w:p>
+            <w:r>
+              <w:t xml:space="preserve">Promo Link</w:t>
+            </w:r>
+          </w:p>
+        </w:tc>
+        <w:tc>
+          <w:p>
+            <w:r>
+              <w:t xml:space="preserve">/promociones/{id}</w:t>
             </w:r>
           </w:p>
         </w:tc>

</xml_diff>

<commit_message>
feat(blocks): optional Styles and Classname rows in every block
- scripts/block-options.js: reads the optional "Styles" and "Classname"
  rows of any block, applies them to the block element (its main class)
  and removes the rows so the block's own code never sees them.
  Styles: declarations separated by ";" (commas can be part of CSS
  values), bare numbers get px, !important supported, unsafe values
  (url(), expression(), javascript:, @import, <, >, braces) skipped.
  Classname: names separated by spaces or commas, invalid names skipped
- scripts.js: decorateMain calls it for every block, so current and
  future blocks get it without extra code
- content-drive/index.docx: empty Styles / Classname rows right after
  the block name in Hero Novamovil, Card Categories, Card Featured and
  Card Promotions

Co-Authored-By: Claude Opus 5.5 (1M context) <noreply@anthropic.com>
</commit_message>
<xml_diff>
--- a/content-drive/index.docx
+++ b/content-drive/index.docx
@@ -28,6 +28,30 @@
               <w:t xml:space="preserve">Hero Novamovil</w:t>
             </w:r>
           </w:p>
+        </w:tc>
+      </w:tr>
+      <w:tr>
+        <w:tc>
+          <w:p>
+            <w:r>
+              <w:t xml:space="preserve">Styles</w:t>
+            </w:r>
+          </w:p>
+        </w:tc>
+        <w:tc>
+          <w:p/>
+        </w:tc>
+      </w:tr>
+      <w:tr>
+        <w:tc>
+          <w:p>
+            <w:r>
+              <w:t xml:space="preserve">Classname</w:t>
+            </w:r>
+          </w:p>
+        </w:tc>
+        <w:tc>
+          <w:p/>
         </w:tc>
       </w:tr>
       <w:tr>
@@ -220,6 +244,30 @@
         <w:tc>
           <w:p>
             <w:r>
+              <w:t xml:space="preserve">Styles</w:t>
+            </w:r>
+          </w:p>
+        </w:tc>
+        <w:tc>
+          <w:p/>
+        </w:tc>
+      </w:tr>
+      <w:tr>
+        <w:tc>
+          <w:p>
+            <w:r>
+              <w:t xml:space="preserve">Classname</w:t>
+            </w:r>
+          </w:p>
+        </w:tc>
+        <w:tc>
+          <w:p/>
+        </w:tc>
+      </w:tr>
+      <w:tr>
+        <w:tc>
+          <w:p>
+            <w:r>
               <w:t xml:space="preserve">Endpoint</w:t>
             </w:r>
           </w:p>
@@ -309,6 +357,30 @@
         <w:tc>
           <w:p>
             <w:r>
+              <w:t xml:space="preserve">Styles</w:t>
+            </w:r>
+          </w:p>
+        </w:tc>
+        <w:tc>
+          <w:p/>
+        </w:tc>
+      </w:tr>
+      <w:tr>
+        <w:tc>
+          <w:p>
+            <w:r>
+              <w:t xml:space="preserve">Classname</w:t>
+            </w:r>
+          </w:p>
+        </w:tc>
+        <w:tc>
+          <w:p/>
+        </w:tc>
+      </w:tr>
+      <w:tr>
+        <w:tc>
+          <w:p>
+            <w:r>
               <w:t xml:space="preserve">Title</w:t>
             </w:r>
           </w:p>
@@ -446,6 +518,30 @@
               <w:t xml:space="preserve">Card Promotions</w:t>
             </w:r>
           </w:p>
+        </w:tc>
+      </w:tr>
+      <w:tr>
+        <w:tc>
+          <w:p>
+            <w:r>
+              <w:t xml:space="preserve">Styles</w:t>
+            </w:r>
+          </w:p>
+        </w:tc>
+        <w:tc>
+          <w:p/>
+        </w:tc>
+      </w:tr>
+      <w:tr>
+        <w:tc>
+          <w:p>
+            <w:r>
+              <w:t xml:space="preserve">Classname</w:t>
+            </w:r>
+          </w:p>
+        </w:tc>
+        <w:tc>
+          <w:p/>
         </w:tc>
       </w:tr>
       <w:tr>

</xml_diff>

<commit_message>
feat(blocks): Styles and Classname wrap the whole block, title included
- Shared buildBlockHeader renders the title/link inside every card block,
  so authored margins/classes apply around title + cards
- card-categories takes its title from a Title row
- Authored margins no longer collapse into the section spacing

Co-Authored-By: Claude Opus 5.5 (1M context) <noreply@anthropic.com>
</commit_message>
<xml_diff>
--- a/content-drive/index.docx
+++ b/content-drive/index.docx
@@ -204,14 +204,6 @@
         <w:t xml:space="preserve">---</w:t>
       </w:r>
     </w:p>
-    <w:p>
-      <w:pPr>
-        <w:pStyle w:val="Heading2"/>
-      </w:pPr>
-      <w:r>
-        <w:t xml:space="preserve">Categorías</w:t>
-      </w:r>
-    </w:p>
     <w:tbl>
       <w:tblPr>
         <w:tblW w:w="0" w:type="auto"/>
@@ -262,6 +254,22 @@
         </w:tc>
         <w:tc>
           <w:p/>
+        </w:tc>
+      </w:tr>
+      <w:tr>
+        <w:tc>
+          <w:p>
+            <w:r>
+              <w:t xml:space="preserve">Title</w:t>
+            </w:r>
+          </w:p>
+        </w:tc>
+        <w:tc>
+          <w:p>
+            <w:r>
+              <w:t xml:space="preserve">Categorías</w:t>
+            </w:r>
+          </w:p>
         </w:tc>
       </w:tr>
       <w:tr>

</xml_diff>

<commit_message>
feat(hero-novamovil): one authored row per element, built with divs
- Rows: Eyebrow, Title, Description, Button N, Stat N (value, label),
  Image; all optional, any order, numbered rows sorted by number
  (Button 1 = primary). No heading detection (HEADING removed).
- Markup is all divs: the title is div[role=heading][aria-level=1],
  stats are div[role=list] with div[role=listitem]; links stay <a>, the
  image stays picture/img. Italic in Title becomes span.hero-highlight.
- block-options.js: Styles/Classname rows may have extra empty cells
  (3-column tables such as the hero).
- content-drive/index.docx regenerated with the new table; panel
  re-imported. documentation/03-hero-novamovil.md explains the table.
Hero renders identical at 375/800/1377px and in both button hovers.

Co-Authored-By: Claude Opus 5.5 (1M context) <noreply@anthropic.com>
</commit_message>
<xml_diff>
--- a/content-drive/index.docx
+++ b/content-drive/index.docx
@@ -17,11 +17,12 @@
       <w:tblGrid>
         <w:gridCol w:w="4500"/>
         <w:gridCol w:w="4500"/>
+        <w:gridCol w:w="4500"/>
       </w:tblGrid>
       <w:tr>
         <w:tc>
           <w:tcPr>
-            <w:gridSpan w:val="2"/>
+            <w:gridSpan w:val="3"/>
           </w:tcPr>
           <w:p>
             <w:r>
@@ -58,13 +59,28 @@
         <w:tc>
           <w:p>
             <w:r>
+              <w:t xml:space="preserve">Eyebrow</w:t>
+            </w:r>
+          </w:p>
+        </w:tc>
+        <w:tc>
+          <w:p>
+            <w:r>
               <w:t xml:space="preserve">Lanzamiento exclusivo 2026</w:t>
             </w:r>
           </w:p>
-          <w:p>
-            <w:pPr>
-              <w:pStyle w:val="Heading1"/>
-            </w:pPr>
+        </w:tc>
+      </w:tr>
+      <w:tr>
+        <w:tc>
+          <w:p>
+            <w:r>
+              <w:t xml:space="preserve">Title</w:t>
+            </w:r>
+          </w:p>
+        </w:tc>
+        <w:tc>
+          <w:p>
             <w:r>
               <w:t xml:space="preserve">El futuro de la </w:t>
             </w:r>
@@ -78,16 +94,37 @@
               <w:t xml:space="preserve"> está aquí</w:t>
             </w:r>
           </w:p>
+        </w:tc>
+      </w:tr>
+      <w:tr>
+        <w:tc>
+          <w:p>
+            <w:r>
+              <w:t xml:space="preserve">Description</w:t>
+            </w:r>
+          </w:p>
+        </w:tc>
+        <w:tc>
           <w:p>
             <w:r>
               <w:t xml:space="preserve">Los mejores smartphones del mercado con planes ilimitados diseñados para México. Conéctate sin límites.</w:t>
             </w:r>
           </w:p>
+        </w:tc>
+      </w:tr>
+      <w:tr>
+        <w:tc>
+          <w:p>
+            <w:r>
+              <w:t xml:space="preserve">Button 1</w:t>
+            </w:r>
+          </w:p>
+        </w:tc>
+        <w:tc>
           <w:p>
             <w:hyperlink r:id="rIdL1">
               <w:r>
                 <w:rPr>
-                  <w:b/>
                   <w:color w:val="1155CC"/>
                   <w:u w:val="single"/>
                 </w:rPr>
@@ -95,11 +132,21 @@
               </w:r>
             </w:hyperlink>
           </w:p>
+        </w:tc>
+      </w:tr>
+      <w:tr>
+        <w:tc>
+          <w:p>
+            <w:r>
+              <w:t xml:space="preserve">Button 2</w:t>
+            </w:r>
+          </w:p>
+        </w:tc>
+        <w:tc>
           <w:p>
             <w:hyperlink r:id="rIdL2">
               <w:r>
                 <w:rPr>
-                  <w:i/>
                   <w:color w:val="1155CC"/>
                   <w:u w:val="single"/>
                 </w:rPr>
@@ -107,55 +154,82 @@
               </w:r>
             </w:hyperlink>
           </w:p>
-          <w:p>
-            <w:pPr>
-              <w:numPr>
-                <w:ilvl w:val="0"/>
-                <w:numId w:val="1"/>
-              </w:numPr>
-            </w:pPr>
-            <w:r>
-              <w:rPr>
-                <w:b/>
-              </w:rPr>
+        </w:tc>
+      </w:tr>
+      <w:tr>
+        <w:tc>
+          <w:p>
+            <w:r>
+              <w:t xml:space="preserve">Stat 1</w:t>
+            </w:r>
+          </w:p>
+        </w:tc>
+        <w:tc>
+          <w:p>
+            <w:r>
               <w:t xml:space="preserve">4.9M+</w:t>
             </w:r>
-            <w:r>
-              <w:t xml:space="preserve"> Usuarios activos</w:t>
-            </w:r>
-          </w:p>
-          <w:p>
-            <w:pPr>
-              <w:numPr>
-                <w:ilvl w:val="0"/>
-                <w:numId w:val="1"/>
-              </w:numPr>
-            </w:pPr>
-            <w:r>
-              <w:rPr>
-                <w:b/>
-              </w:rPr>
+          </w:p>
+        </w:tc>
+        <w:tc>
+          <w:p>
+            <w:r>
+              <w:t xml:space="preserve">Usuarios activos</w:t>
+            </w:r>
+          </w:p>
+        </w:tc>
+      </w:tr>
+      <w:tr>
+        <w:tc>
+          <w:p>
+            <w:r>
+              <w:t xml:space="preserve">Stat 2</w:t>
+            </w:r>
+          </w:p>
+        </w:tc>
+        <w:tc>
+          <w:p>
+            <w:r>
               <w:t xml:space="preserve">99.8%</w:t>
             </w:r>
-            <w:r>
-              <w:t xml:space="preserve"> Cobertura 5G</w:t>
-            </w:r>
-          </w:p>
-          <w:p>
-            <w:pPr>
-              <w:numPr>
-                <w:ilvl w:val="0"/>
-                <w:numId w:val="1"/>
-              </w:numPr>
-            </w:pPr>
-            <w:r>
-              <w:rPr>
-                <w:b/>
-              </w:rPr>
+          </w:p>
+        </w:tc>
+        <w:tc>
+          <w:p>
+            <w:r>
+              <w:t xml:space="preserve">Cobertura 5G</w:t>
+            </w:r>
+          </w:p>
+        </w:tc>
+      </w:tr>
+      <w:tr>
+        <w:tc>
+          <w:p>
+            <w:r>
+              <w:t xml:space="preserve">Stat 3</w:t>
+            </w:r>
+          </w:p>
+        </w:tc>
+        <w:tc>
+          <w:p>
+            <w:r>
               <w:t xml:space="preserve">24/7</w:t>
             </w:r>
-            <w:r>
-              <w:t xml:space="preserve"> Soporte</w:t>
+          </w:p>
+        </w:tc>
+        <w:tc>
+          <w:p>
+            <w:r>
+              <w:t xml:space="preserve">Soporte</w:t>
+            </w:r>
+          </w:p>
+        </w:tc>
+      </w:tr>
+      <w:tr>
+        <w:tc>
+          <w:p>
+            <w:r>
+              <w:t xml:space="preserve">Image</w:t>
             </w:r>
           </w:p>
         </w:tc>

</xml_diff>

<commit_message>
feat(hero-novamovil): rename Eyebrow row to Tag; index.docx tables fit the page
- Hero row "Eyebrow" is now "Tag" (class hero-tag, colour tokens
  --hero-novamovil-tag-*); docs updated.
- content-drive/index.docx: page size set (Letter, 1in margins) and every
  table is exactly the text width (6.5in): 1.5in name column, the rest
  split evenly, short rows span to the last column. The hero table (3
  columns) no longer runs off the page and its image fits its cell.
Hero renders identical at 375/800/1377px.

Co-Authored-By: Claude Opus 5.5 (1M context) <noreply@anthropic.com>
</commit_message>
<xml_diff>
--- a/content-drive/index.docx
+++ b/content-drive/index.docx
@@ -4,7 +4,8 @@
   <w:body>
     <w:tbl>
       <w:tblPr>
-        <w:tblW w:w="0" w:type="auto"/>
+        <w:tblW w:w="9360" w:type="dxa"/>
+        <w:tblLayout w:type="fixed"/>
         <w:tblBorders>
           <w:top w:val="single" w:sz="4" w:color="999999"/>
           <w:left w:val="single" w:sz="4" w:color="999999"/>
@@ -15,13 +16,14 @@
         </w:tblBorders>
       </w:tblPr>
       <w:tblGrid>
-        <w:gridCol w:w="4500"/>
-        <w:gridCol w:w="4500"/>
-        <w:gridCol w:w="4500"/>
+        <w:gridCol w:w="2160"/>
+        <w:gridCol w:w="3600"/>
+        <w:gridCol w:w="3600"/>
       </w:tblGrid>
       <w:tr>
         <w:tc>
           <w:tcPr>
+            <w:tcW w:w="9360" w:type="dxa"/>
             <w:gridSpan w:val="3"/>
           </w:tcPr>
           <w:p>
@@ -33,6 +35,9 @@
       </w:tr>
       <w:tr>
         <w:tc>
+          <w:tcPr>
+            <w:tcW w:w="2160" w:type="dxa"/>
+          </w:tcPr>
           <w:p>
             <w:r>
               <w:t xml:space="preserve">Styles</w:t>
@@ -40,11 +45,18 @@
           </w:p>
         </w:tc>
         <w:tc>
+          <w:tcPr>
+            <w:tcW w:w="7200" w:type="dxa"/>
+            <w:gridSpan w:val="2"/>
+          </w:tcPr>
           <w:p/>
         </w:tc>
       </w:tr>
       <w:tr>
         <w:tc>
+          <w:tcPr>
+            <w:tcW w:w="2160" w:type="dxa"/>
+          </w:tcPr>
           <w:p>
             <w:r>
               <w:t xml:space="preserve">Classname</w:t>
@@ -52,18 +64,29 @@
           </w:p>
         </w:tc>
         <w:tc>
+          <w:tcPr>
+            <w:tcW w:w="7200" w:type="dxa"/>
+            <w:gridSpan w:val="2"/>
+          </w:tcPr>
           <w:p/>
         </w:tc>
       </w:tr>
       <w:tr>
         <w:tc>
-          <w:p>
-            <w:r>
-              <w:t xml:space="preserve">Eyebrow</w:t>
-            </w:r>
-          </w:p>
-        </w:tc>
-        <w:tc>
+          <w:tcPr>
+            <w:tcW w:w="2160" w:type="dxa"/>
+          </w:tcPr>
+          <w:p>
+            <w:r>
+              <w:t xml:space="preserve">Tag</w:t>
+            </w:r>
+          </w:p>
+        </w:tc>
+        <w:tc>
+          <w:tcPr>
+            <w:tcW w:w="7200" w:type="dxa"/>
+            <w:gridSpan w:val="2"/>
+          </w:tcPr>
           <w:p>
             <w:r>
               <w:t xml:space="preserve">Lanzamiento exclusivo 2026</w:t>
@@ -73,6 +96,9 @@
       </w:tr>
       <w:tr>
         <w:tc>
+          <w:tcPr>
+            <w:tcW w:w="2160" w:type="dxa"/>
+          </w:tcPr>
           <w:p>
             <w:r>
               <w:t xml:space="preserve">Title</w:t>
@@ -80,6 +106,10 @@
           </w:p>
         </w:tc>
         <w:tc>
+          <w:tcPr>
+            <w:tcW w:w="7200" w:type="dxa"/>
+            <w:gridSpan w:val="2"/>
+          </w:tcPr>
           <w:p>
             <w:r>
               <w:t xml:space="preserve">El futuro de la </w:t>
@@ -98,6 +128,9 @@
       </w:tr>
       <w:tr>
         <w:tc>
+          <w:tcPr>
+            <w:tcW w:w="2160" w:type="dxa"/>
+          </w:tcPr>
           <w:p>
             <w:r>
               <w:t xml:space="preserve">Description</w:t>
@@ -105,6 +138,10 @@
           </w:p>
         </w:tc>
         <w:tc>
+          <w:tcPr>
+            <w:tcW w:w="7200" w:type="dxa"/>
+            <w:gridSpan w:val="2"/>
+          </w:tcPr>
           <w:p>
             <w:r>
               <w:t xml:space="preserve">Los mejores smartphones del mercado con planes ilimitados diseñados para México. Conéctate sin límites.</w:t>
@@ -114,6 +151,9 @@
       </w:tr>
       <w:tr>
         <w:tc>
+          <w:tcPr>
+            <w:tcW w:w="2160" w:type="dxa"/>
+          </w:tcPr>
           <w:p>
             <w:r>
               <w:t xml:space="preserve">Button 1</w:t>
@@ -121,6 +161,10 @@
           </w:p>
         </w:tc>
         <w:tc>
+          <w:tcPr>
+            <w:tcW w:w="7200" w:type="dxa"/>
+            <w:gridSpan w:val="2"/>
+          </w:tcPr>
           <w:p>
             <w:hyperlink r:id="rIdL1">
               <w:r>
@@ -136,6 +180,9 @@
       </w:tr>
       <w:tr>
         <w:tc>
+          <w:tcPr>
+            <w:tcW w:w="2160" w:type="dxa"/>
+          </w:tcPr>
           <w:p>
             <w:r>
               <w:t xml:space="preserve">Button 2</w:t>
@@ -143,6 +190,10 @@
           </w:p>
         </w:tc>
         <w:tc>
+          <w:tcPr>
+            <w:tcW w:w="7200" w:type="dxa"/>
+            <w:gridSpan w:val="2"/>
+          </w:tcPr>
           <w:p>
             <w:hyperlink r:id="rIdL2">
               <w:r>
@@ -158,6 +209,9 @@
       </w:tr>
       <w:tr>
         <w:tc>
+          <w:tcPr>
+            <w:tcW w:w="2160" w:type="dxa"/>
+          </w:tcPr>
           <w:p>
             <w:r>
               <w:t xml:space="preserve">Stat 1</w:t>
@@ -165,6 +219,9 @@
           </w:p>
         </w:tc>
         <w:tc>
+          <w:tcPr>
+            <w:tcW w:w="3600" w:type="dxa"/>
+          </w:tcPr>
           <w:p>
             <w:r>
               <w:t xml:space="preserve">4.9M+</w:t>
@@ -172,6 +229,9 @@
           </w:p>
         </w:tc>
         <w:tc>
+          <w:tcPr>
+            <w:tcW w:w="3600" w:type="dxa"/>
+          </w:tcPr>
           <w:p>
             <w:r>
               <w:t xml:space="preserve">Usuarios activos</w:t>
@@ -181,6 +241,9 @@
       </w:tr>
       <w:tr>
         <w:tc>
+          <w:tcPr>
+            <w:tcW w:w="2160" w:type="dxa"/>
+          </w:tcPr>
           <w:p>
             <w:r>
               <w:t xml:space="preserve">Stat 2</w:t>
@@ -188,6 +251,9 @@
           </w:p>
         </w:tc>
         <w:tc>
+          <w:tcPr>
+            <w:tcW w:w="3600" w:type="dxa"/>
+          </w:tcPr>
           <w:p>
             <w:r>
               <w:t xml:space="preserve">99.8%</w:t>
@@ -195,6 +261,9 @@
           </w:p>
         </w:tc>
         <w:tc>
+          <w:tcPr>
+            <w:tcW w:w="3600" w:type="dxa"/>
+          </w:tcPr>
           <w:p>
             <w:r>
               <w:t xml:space="preserve">Cobertura 5G</w:t>
@@ -204,6 +273,9 @@
       </w:tr>
       <w:tr>
         <w:tc>
+          <w:tcPr>
+            <w:tcW w:w="2160" w:type="dxa"/>
+          </w:tcPr>
           <w:p>
             <w:r>
               <w:t xml:space="preserve">Stat 3</w:t>
@@ -211,6 +283,9 @@
           </w:p>
         </w:tc>
         <w:tc>
+          <w:tcPr>
+            <w:tcW w:w="3600" w:type="dxa"/>
+          </w:tcPr>
           <w:p>
             <w:r>
               <w:t xml:space="preserve">24/7</w:t>
@@ -218,6 +293,9 @@
           </w:p>
         </w:tc>
         <w:tc>
+          <w:tcPr>
+            <w:tcW w:w="3600" w:type="dxa"/>
+          </w:tcPr>
           <w:p>
             <w:r>
               <w:t xml:space="preserve">Soporte</w:t>
@@ -227,6 +305,9 @@
       </w:tr>
       <w:tr>
         <w:tc>
+          <w:tcPr>
+            <w:tcW w:w="2160" w:type="dxa"/>
+          </w:tcPr>
           <w:p>
             <w:r>
               <w:t xml:space="preserve">Image</w:t>
@@ -234,6 +315,10 @@
           </w:p>
         </w:tc>
         <w:tc>
+          <w:tcPr>
+            <w:tcW w:w="7200" w:type="dxa"/>
+            <w:gridSpan w:val="2"/>
+          </w:tcPr>
           <w:p>
             <w:r>
               <w:drawing>
@@ -280,7 +365,8 @@
     </w:p>
     <w:tbl>
       <w:tblPr>
-        <w:tblW w:w="0" w:type="auto"/>
+        <w:tblW w:w="9360" w:type="dxa"/>
+        <w:tblLayout w:type="fixed"/>
         <w:tblBorders>
           <w:top w:val="single" w:sz="4" w:color="999999"/>
           <w:left w:val="single" w:sz="4" w:color="999999"/>
@@ -291,12 +377,13 @@
         </w:tblBorders>
       </w:tblPr>
       <w:tblGrid>
-        <w:gridCol w:w="4500"/>
-        <w:gridCol w:w="4500"/>
+        <w:gridCol w:w="2160"/>
+        <w:gridCol w:w="7200"/>
       </w:tblGrid>
       <w:tr>
         <w:tc>
           <w:tcPr>
+            <w:tcW w:w="9360" w:type="dxa"/>
             <w:gridSpan w:val="2"/>
           </w:tcPr>
           <w:p>
@@ -308,6 +395,9 @@
       </w:tr>
       <w:tr>
         <w:tc>
+          <w:tcPr>
+            <w:tcW w:w="2160" w:type="dxa"/>
+          </w:tcPr>
           <w:p>
             <w:r>
               <w:t xml:space="preserve">Styles</w:t>
@@ -315,11 +405,17 @@
           </w:p>
         </w:tc>
         <w:tc>
+          <w:tcPr>
+            <w:tcW w:w="7200" w:type="dxa"/>
+          </w:tcPr>
           <w:p/>
         </w:tc>
       </w:tr>
       <w:tr>
         <w:tc>
+          <w:tcPr>
+            <w:tcW w:w="2160" w:type="dxa"/>
+          </w:tcPr>
           <w:p>
             <w:r>
               <w:t xml:space="preserve">Classname</w:t>
@@ -327,11 +423,17 @@
           </w:p>
         </w:tc>
         <w:tc>
+          <w:tcPr>
+            <w:tcW w:w="7200" w:type="dxa"/>
+          </w:tcPr>
           <w:p/>
         </w:tc>
       </w:tr>
       <w:tr>
         <w:tc>
+          <w:tcPr>
+            <w:tcW w:w="2160" w:type="dxa"/>
+          </w:tcPr>
           <w:p>
             <w:r>
               <w:t xml:space="preserve">Title</w:t>
@@ -339,6 +441,9 @@
           </w:p>
         </w:tc>
         <w:tc>
+          <w:tcPr>
+            <w:tcW w:w="7200" w:type="dxa"/>
+          </w:tcPr>
           <w:p>
             <w:r>
               <w:t xml:space="preserve">Categorías</w:t>
@@ -348,6 +453,9 @@
       </w:tr>
       <w:tr>
         <w:tc>
+          <w:tcPr>
+            <w:tcW w:w="2160" w:type="dxa"/>
+          </w:tcPr>
           <w:p>
             <w:r>
               <w:t xml:space="preserve">Endpoint</w:t>
@@ -355,6 +463,9 @@
           </w:p>
         </w:tc>
         <w:tc>
+          <w:tcPr>
+            <w:tcW w:w="7200" w:type="dxa"/>
+          </w:tcPr>
           <w:p>
             <w:hyperlink r:id="rIdL3">
               <w:r>
@@ -370,6 +481,9 @@
       </w:tr>
       <w:tr>
         <w:tc>
+          <w:tcPr>
+            <w:tcW w:w="2160" w:type="dxa"/>
+          </w:tcPr>
           <w:p>
             <w:r>
               <w:t xml:space="preserve">Alert Duration</w:t>
@@ -377,6 +491,9 @@
           </w:p>
         </w:tc>
         <w:tc>
+          <w:tcPr>
+            <w:tcW w:w="7200" w:type="dxa"/>
+          </w:tcPr>
           <w:p>
             <w:r>
               <w:t xml:space="preserve">5</w:t>
@@ -386,6 +503,9 @@
       </w:tr>
       <w:tr>
         <w:tc>
+          <w:tcPr>
+            <w:tcW w:w="2160" w:type="dxa"/>
+          </w:tcPr>
           <w:p>
             <w:r>
               <w:t xml:space="preserve">Alert Color</w:t>
@@ -393,6 +513,9 @@
           </w:p>
         </w:tc>
         <w:tc>
+          <w:tcPr>
+            <w:tcW w:w="7200" w:type="dxa"/>
+          </w:tcPr>
           <w:p>
             <w:r>
               <w:t xml:space="preserve">error</w:t>
@@ -409,7 +532,8 @@
     </w:p>
     <w:tbl>
       <w:tblPr>
-        <w:tblW w:w="0" w:type="auto"/>
+        <w:tblW w:w="9360" w:type="dxa"/>
+        <w:tblLayout w:type="fixed"/>
         <w:tblBorders>
           <w:top w:val="single" w:sz="4" w:color="999999"/>
           <w:left w:val="single" w:sz="4" w:color="999999"/>
@@ -420,12 +544,13 @@
         </w:tblBorders>
       </w:tblPr>
       <w:tblGrid>
-        <w:gridCol w:w="4500"/>
-        <w:gridCol w:w="4500"/>
+        <w:gridCol w:w="2160"/>
+        <w:gridCol w:w="7200"/>
       </w:tblGrid>
       <w:tr>
         <w:tc>
           <w:tcPr>
+            <w:tcW w:w="9360" w:type="dxa"/>
             <w:gridSpan w:val="2"/>
           </w:tcPr>
           <w:p>
@@ -437,6 +562,9 @@
       </w:tr>
       <w:tr>
         <w:tc>
+          <w:tcPr>
+            <w:tcW w:w="2160" w:type="dxa"/>
+          </w:tcPr>
           <w:p>
             <w:r>
               <w:t xml:space="preserve">Styles</w:t>
@@ -444,11 +572,17 @@
           </w:p>
         </w:tc>
         <w:tc>
+          <w:tcPr>
+            <w:tcW w:w="7200" w:type="dxa"/>
+          </w:tcPr>
           <w:p/>
         </w:tc>
       </w:tr>
       <w:tr>
         <w:tc>
+          <w:tcPr>
+            <w:tcW w:w="2160" w:type="dxa"/>
+          </w:tcPr>
           <w:p>
             <w:r>
               <w:t xml:space="preserve">Classname</w:t>
@@ -456,11 +590,17 @@
           </w:p>
         </w:tc>
         <w:tc>
+          <w:tcPr>
+            <w:tcW w:w="7200" w:type="dxa"/>
+          </w:tcPr>
           <w:p/>
         </w:tc>
       </w:tr>
       <w:tr>
         <w:tc>
+          <w:tcPr>
+            <w:tcW w:w="2160" w:type="dxa"/>
+          </w:tcPr>
           <w:p>
             <w:r>
               <w:t xml:space="preserve">Title</w:t>
@@ -468,6 +608,9 @@
           </w:p>
         </w:tc>
         <w:tc>
+          <w:tcPr>
+            <w:tcW w:w="7200" w:type="dxa"/>
+          </w:tcPr>
           <w:p>
             <w:r>
               <w:t xml:space="preserve">Productos destacados</w:t>
@@ -477,6 +620,9 @@
       </w:tr>
       <w:tr>
         <w:tc>
+          <w:tcPr>
+            <w:tcW w:w="2160" w:type="dxa"/>
+          </w:tcPr>
           <w:p>
             <w:r>
               <w:t xml:space="preserve">Link</w:t>
@@ -484,6 +630,9 @@
           </w:p>
         </w:tc>
         <w:tc>
+          <w:tcPr>
+            <w:tcW w:w="7200" w:type="dxa"/>
+          </w:tcPr>
           <w:p>
             <w:hyperlink r:id="rIdL4">
               <w:r>
@@ -499,6 +648,9 @@
       </w:tr>
       <w:tr>
         <w:tc>
+          <w:tcPr>
+            <w:tcW w:w="2160" w:type="dxa"/>
+          </w:tcPr>
           <w:p>
             <w:r>
               <w:t xml:space="preserve">Endpoint</w:t>
@@ -506,6 +658,9 @@
           </w:p>
         </w:tc>
         <w:tc>
+          <w:tcPr>
+            <w:tcW w:w="7200" w:type="dxa"/>
+          </w:tcPr>
           <w:p>
             <w:hyperlink r:id="rIdL5">
               <w:r>
@@ -521,6 +676,9 @@
       </w:tr>
       <w:tr>
         <w:tc>
+          <w:tcPr>
+            <w:tcW w:w="2160" w:type="dxa"/>
+          </w:tcPr>
           <w:p>
             <w:r>
               <w:t xml:space="preserve">Product Link</w:t>
@@ -528,6 +686,9 @@
           </w:p>
         </w:tc>
         <w:tc>
+          <w:tcPr>
+            <w:tcW w:w="7200" w:type="dxa"/>
+          </w:tcPr>
           <w:p>
             <w:r>
               <w:t xml:space="preserve">/productos/{sku}</w:t>
@@ -537,6 +698,9 @@
       </w:tr>
       <w:tr>
         <w:tc>
+          <w:tcPr>
+            <w:tcW w:w="2160" w:type="dxa"/>
+          </w:tcPr>
           <w:p>
             <w:r>
               <w:t xml:space="preserve">Alert Duration</w:t>
@@ -544,6 +708,9 @@
           </w:p>
         </w:tc>
         <w:tc>
+          <w:tcPr>
+            <w:tcW w:w="7200" w:type="dxa"/>
+          </w:tcPr>
           <w:p>
             <w:r>
               <w:t xml:space="preserve">5</w:t>
@@ -553,6 +720,9 @@
       </w:tr>
       <w:tr>
         <w:tc>
+          <w:tcPr>
+            <w:tcW w:w="2160" w:type="dxa"/>
+          </w:tcPr>
           <w:p>
             <w:r>
               <w:t xml:space="preserve">Alert Color</w:t>
@@ -560,6 +730,9 @@
           </w:p>
         </w:tc>
         <w:tc>
+          <w:tcPr>
+            <w:tcW w:w="7200" w:type="dxa"/>
+          </w:tcPr>
           <w:p>
             <w:r>
               <w:t xml:space="preserve">error</w:t>
@@ -576,7 +749,8 @@
     </w:p>
     <w:tbl>
       <w:tblPr>
-        <w:tblW w:w="0" w:type="auto"/>
+        <w:tblW w:w="9360" w:type="dxa"/>
+        <w:tblLayout w:type="fixed"/>
         <w:tblBorders>
           <w:top w:val="single" w:sz="4" w:color="999999"/>
           <w:left w:val="single" w:sz="4" w:color="999999"/>
@@ -587,12 +761,13 @@
         </w:tblBorders>
       </w:tblPr>
       <w:tblGrid>
-        <w:gridCol w:w="4500"/>
-        <w:gridCol w:w="4500"/>
+        <w:gridCol w:w="2160"/>
+        <w:gridCol w:w="7200"/>
       </w:tblGrid>
       <w:tr>
         <w:tc>
           <w:tcPr>
+            <w:tcW w:w="9360" w:type="dxa"/>
             <w:gridSpan w:val="2"/>
           </w:tcPr>
           <w:p>
@@ -604,6 +779,9 @@
       </w:tr>
       <w:tr>
         <w:tc>
+          <w:tcPr>
+            <w:tcW w:w="2160" w:type="dxa"/>
+          </w:tcPr>
           <w:p>
             <w:r>
               <w:t xml:space="preserve">Styles</w:t>
@@ -611,11 +789,17 @@
           </w:p>
         </w:tc>
         <w:tc>
+          <w:tcPr>
+            <w:tcW w:w="7200" w:type="dxa"/>
+          </w:tcPr>
           <w:p/>
         </w:tc>
       </w:tr>
       <w:tr>
         <w:tc>
+          <w:tcPr>
+            <w:tcW w:w="2160" w:type="dxa"/>
+          </w:tcPr>
           <w:p>
             <w:r>
               <w:t xml:space="preserve">Classname</w:t>
@@ -623,11 +807,17 @@
           </w:p>
         </w:tc>
         <w:tc>
+          <w:tcPr>
+            <w:tcW w:w="7200" w:type="dxa"/>
+          </w:tcPr>
           <w:p/>
         </w:tc>
       </w:tr>
       <w:tr>
         <w:tc>
+          <w:tcPr>
+            <w:tcW w:w="2160" w:type="dxa"/>
+          </w:tcPr>
           <w:p>
             <w:r>
               <w:t xml:space="preserve">Title</w:t>
@@ -635,6 +825,9 @@
           </w:p>
         </w:tc>
         <w:tc>
+          <w:tcPr>
+            <w:tcW w:w="7200" w:type="dxa"/>
+          </w:tcPr>
           <w:p>
             <w:r>
               <w:t xml:space="preserve">Promociones</w:t>
@@ -644,6 +837,9 @@
       </w:tr>
       <w:tr>
         <w:tc>
+          <w:tcPr>
+            <w:tcW w:w="2160" w:type="dxa"/>
+          </w:tcPr>
           <w:p>
             <w:r>
               <w:t xml:space="preserve">Endpoint</w:t>
@@ -651,6 +847,9 @@
           </w:p>
         </w:tc>
         <w:tc>
+          <w:tcPr>
+            <w:tcW w:w="7200" w:type="dxa"/>
+          </w:tcPr>
           <w:p>
             <w:hyperlink r:id="rIdL6">
               <w:r>
@@ -666,6 +865,9 @@
       </w:tr>
       <w:tr>
         <w:tc>
+          <w:tcPr>
+            <w:tcW w:w="2160" w:type="dxa"/>
+          </w:tcPr>
           <w:p>
             <w:r>
               <w:t xml:space="preserve">Promo Link</w:t>
@@ -673,6 +875,9 @@
           </w:p>
         </w:tc>
         <w:tc>
+          <w:tcPr>
+            <w:tcW w:w="7200" w:type="dxa"/>
+          </w:tcPr>
           <w:p>
             <w:r>
               <w:t xml:space="preserve">/promociones/{id}</w:t>
@@ -682,6 +887,9 @@
       </w:tr>
       <w:tr>
         <w:tc>
+          <w:tcPr>
+            <w:tcW w:w="2160" w:type="dxa"/>
+          </w:tcPr>
           <w:p>
             <w:r>
               <w:t xml:space="preserve">Alert Duration</w:t>
@@ -689,6 +897,9 @@
           </w:p>
         </w:tc>
         <w:tc>
+          <w:tcPr>
+            <w:tcW w:w="7200" w:type="dxa"/>
+          </w:tcPr>
           <w:p>
             <w:r>
               <w:t xml:space="preserve">5</w:t>
@@ -698,6 +909,9 @@
       </w:tr>
       <w:tr>
         <w:tc>
+          <w:tcPr>
+            <w:tcW w:w="2160" w:type="dxa"/>
+          </w:tcPr>
           <w:p>
             <w:r>
               <w:t xml:space="preserve">Alert Color</w:t>
@@ -705,6 +919,9 @@
           </w:p>
         </w:tc>
         <w:tc>
+          <w:tcPr>
+            <w:tcW w:w="7200" w:type="dxa"/>
+          </w:tcPr>
           <w:p>
             <w:r>
               <w:t xml:space="preserve">error</w:t>
@@ -716,7 +933,8 @@
     <w:p/>
     <w:tbl>
       <w:tblPr>
-        <w:tblW w:w="0" w:type="auto"/>
+        <w:tblW w:w="9360" w:type="dxa"/>
+        <w:tblLayout w:type="fixed"/>
         <w:tblBorders>
           <w:top w:val="single" w:sz="4" w:color="999999"/>
           <w:left w:val="single" w:sz="4" w:color="999999"/>
@@ -727,12 +945,13 @@
         </w:tblBorders>
       </w:tblPr>
       <w:tblGrid>
-        <w:gridCol w:w="4500"/>
-        <w:gridCol w:w="4500"/>
+        <w:gridCol w:w="2160"/>
+        <w:gridCol w:w="7200"/>
       </w:tblGrid>
       <w:tr>
         <w:tc>
           <w:tcPr>
+            <w:tcW w:w="9360" w:type="dxa"/>
             <w:gridSpan w:val="2"/>
           </w:tcPr>
           <w:p>
@@ -744,6 +963,9 @@
       </w:tr>
       <w:tr>
         <w:tc>
+          <w:tcPr>
+            <w:tcW w:w="2160" w:type="dxa"/>
+          </w:tcPr>
           <w:p>
             <w:r>
               <w:t xml:space="preserve">Title</w:t>
@@ -751,6 +973,9 @@
           </w:p>
         </w:tc>
         <w:tc>
+          <w:tcPr>
+            <w:tcW w:w="7200" w:type="dxa"/>
+          </w:tcPr>
           <w:p>
             <w:r>
               <w:t xml:space="preserve">NovaMóvil | Celulares, planes y accesorios</w:t>
@@ -760,6 +985,9 @@
       </w:tr>
       <w:tr>
         <w:tc>
+          <w:tcPr>
+            <w:tcW w:w="2160" w:type="dxa"/>
+          </w:tcPr>
           <w:p>
             <w:r>
               <w:t xml:space="preserve">Description</w:t>
@@ -767,6 +995,9 @@
           </w:p>
         </w:tc>
         <w:tc>
+          <w:tcPr>
+            <w:tcW w:w="7200" w:type="dxa"/>
+          </w:tcPr>
           <w:p>
             <w:r>
               <w:t xml:space="preserve">Compra celulares, planes y accesorios con los mejores precios en NovaMóvil.</w:t>
@@ -776,7 +1007,10 @@
       </w:tr>
     </w:tbl>
     <w:p/>
-    <w:sectPr/>
+    <w:sectPr>
+      <w:pgSz w:w="12240" w:h="15840"/>
+      <w:pgMar w:top="1440" w:right="1440" w:bottom="1440" w:left="1440" w:header="720" w:footer="720" w:gutter="0"/>
+    </w:sectPr>
   </w:body>
 </w:document>
 </file>

</xml_diff>

<commit_message>
refactor: descriptive message names; fonts only from the global styles
- scripts/messages.js keys: errorResponseMessage, emptyElementsTitle,
  emptyElementsDescription, elementsListAccessibleName (with a comment
  on when each one is used). Card Categories reads the matching Drive
  rows: Error Response Message, Empty Elements Title, Empty Elements
  Description, Elements List Accessible Name. index.docx + panel updated.
- styles.css: one global [role='heading'] rule gives div headings the
  heading font; header, footer, hero, card-categories, card-featured,
  card-promotions and toast no longer set font-family (all inherit it).
Same font, size and position for every text at 375/800/1377px; only the
fallback font name of h3 product names/footer titles changes (same
Plus Jakarta Sans).

Co-Authored-By: Claude Opus 5.5 (1M context) <noreply@anthropic.com>
</commit_message>
<xml_diff>
--- a/content-drive/index.docx
+++ b/content-drive/index.docx
@@ -530,7 +530,7 @@
           </w:tcPr>
           <w:p>
             <w:r>
-              <w:t xml:space="preserve">Error Message</w:t>
+              <w:t xml:space="preserve">Error Response Message</w:t>
             </w:r>
           </w:p>
         </w:tc>
@@ -552,7 +552,7 @@
           </w:tcPr>
           <w:p>
             <w:r>
-              <w:t xml:space="preserve">Empty Title</w:t>
+              <w:t xml:space="preserve">Empty Elements Title</w:t>
             </w:r>
           </w:p>
         </w:tc>
@@ -574,7 +574,7 @@
           </w:tcPr>
           <w:p>
             <w:r>
-              <w:t xml:space="preserve">Empty Text</w:t>
+              <w:t xml:space="preserve">Empty Elements Description</w:t>
             </w:r>
           </w:p>
         </w:tc>
@@ -596,7 +596,7 @@
           </w:tcPr>
           <w:p>
             <w:r>
-              <w:t xml:space="preserve">List Label</w:t>
+              <w:t xml:space="preserve">Elements List Accessible Name</w:t>
             </w:r>
           </w:p>
         </w:tc>

</xml_diff>

<commit_message>
refactor(card-categories): fixed SKELETON_ELEMENTS, no Skeleton Count row
The loading skeleton always paints SKELETON_ELEMENTS (6) placeholder
cards: MAX_SKELETON_COUNT and the "Skeleton Count" Drive row are gone
(index.docx, panel and docs updated).

Co-Authored-By: Claude Opus 5.5 (1M context) <noreply@anthropic.com>
</commit_message>
<xml_diff>
--- a/content-drive/index.docx
+++ b/content-drive/index.docx
@@ -609,24 +609,6 @@
               <w:t xml:space="preserve">Categorías</w:t>
             </w:r>
           </w:p>
-        </w:tc>
-      </w:tr>
-      <w:tr>
-        <w:tc>
-          <w:tcPr>
-            <w:tcW w:w="2160" w:type="dxa"/>
-          </w:tcPr>
-          <w:p>
-            <w:r>
-              <w:t xml:space="preserve">Skeleton Count</w:t>
-            </w:r>
-          </w:p>
-        </w:tc>
-        <w:tc>
-          <w:tcPr>
-            <w:tcW w:w="7200" w:type="dxa"/>
-          </w:tcPr>
-          <w:p/>
         </w:tc>
       </w:tr>
     </w:tbl>

</xml_diff>

<commit_message>
refactor(card-categories): emptyList* messages, configurable icon, list named by its title
- scripts/messages.js: elementsListAccessibleName removed; emptyElementsTitle
  and emptyElementsDescription renamed to emptyListTitle and
  emptyListDescription (Drive rows Empty List Title / Empty List Description).
- New optional Empty List Icon row; the default stays in the block
  (EMPTY_LIST_ICON, the folder emoji).
- The list is named by the visible title through aria-labelledby, so no
  extra row or message is needed for screen readers.
- index.docx + panel and docs updated.

Co-Authored-By: Claude Opus 5.5 (1M context) <noreply@anthropic.com>
</commit_message>
<xml_diff>
--- a/content-drive/index.docx
+++ b/content-drive/index.docx
@@ -552,7 +552,7 @@
           </w:tcPr>
           <w:p>
             <w:r>
-              <w:t xml:space="preserve">Empty Elements Title</w:t>
+              <w:t xml:space="preserve">Empty List Title</w:t>
             </w:r>
           </w:p>
         </w:tc>
@@ -574,7 +574,7 @@
           </w:tcPr>
           <w:p>
             <w:r>
-              <w:t xml:space="preserve">Empty Elements Description</w:t>
+              <w:t xml:space="preserve">Empty List Description</w:t>
             </w:r>
           </w:p>
         </w:tc>
@@ -596,19 +596,15 @@
           </w:tcPr>
           <w:p>
             <w:r>
-              <w:t xml:space="preserve">Elements List Accessible Name</w:t>
-            </w:r>
-          </w:p>
-        </w:tc>
-        <w:tc>
-          <w:tcPr>
-            <w:tcW w:w="7200" w:type="dxa"/>
-          </w:tcPr>
-          <w:p>
-            <w:r>
-              <w:t xml:space="preserve">Categorías</w:t>
-            </w:r>
-          </w:p>
+              <w:t xml:space="preserve">Empty List Icon</w:t>
+            </w:r>
+          </w:p>
+        </w:tc>
+        <w:tc>
+          <w:tcPr>
+            <w:tcW w:w="7200" w:type="dxa"/>
+          </w:tcPr>
+          <w:p/>
         </w:tc>
       </w:tr>
     </w:tbl>

</xml_diff>

<commit_message>
feat(card-categories): missing row = default, empty row = empty part
- scripts/block-utils.js: readRawCell also returns found (the row exists);
  new readRowText(block, key, fallback) returns the fallback only when the
  row is missing, '' when it is present but empty. buildBlockHeader takes
  an optional resolved title.
- card-categories: Title (DEFAULT_TITLE 'Categorías'), Empty List Title,
  Empty List Description and Empty List Icon follow that rule; the empty
  state only paints the parts that have text, and an empty Title leaves
  the section without a heading (the list then has no aria-labelledby).
- index.docx + panel: Empty List Icon row now carries the emoji. Docs updated.

Co-Authored-By: Claude Opus 5.5 (1M context) <noreply@anthropic.com>
</commit_message>
<xml_diff>
--- a/content-drive/index.docx
+++ b/content-drive/index.docx
@@ -604,7 +604,11 @@
           <w:tcPr>
             <w:tcW w:w="7200" w:type="dxa"/>
           </w:tcPr>
-          <w:p/>
+          <w:p>
+            <w:r>
+              <w:t xml:space="preserve">🗂️</w:t>
+            </w:r>
+          </w:p>
         </w:tc>
       </w:tr>
     </w:tbl>

</xml_diff>